<commit_message>
+tam thoi hoan thanh functional requirement
</commit_message>
<xml_diff>
--- a/Functional Requirements.docx
+++ b/Functional Requirements.docx
@@ -82,6 +82,14 @@
           <w:sz w:val="26"/>
           <w:szCs w:val="26"/>
         </w:rPr>
+        <w:t>-</w:t>
+      </w:r>
+      <w:r>
+        <w:rPr>
+          <w:rFonts w:ascii="Times New Roman" w:hAnsi="Times New Roman" w:cs="Times New Roman"/>
+          <w:sz w:val="26"/>
+          <w:szCs w:val="26"/>
+        </w:rPr>
         <w:t>Hệ thống có khả năng t</w:t>
       </w:r>
       <w:r>
@@ -126,6 +134,14 @@
           <w:sz w:val="26"/>
           <w:szCs w:val="26"/>
         </w:rPr>
+        <w:t>-</w:t>
+      </w:r>
+      <w:r>
+        <w:rPr>
+          <w:rFonts w:ascii="Times New Roman" w:hAnsi="Times New Roman" w:cs="Times New Roman"/>
+          <w:sz w:val="26"/>
+          <w:szCs w:val="26"/>
+        </w:rPr>
         <w:t>Cập nhật thông tin nhân viên (tên, ngày sinh, địa chỉ, phòng ban, chức vụ, số điện thoại).</w:t>
       </w:r>
       <w:r>
@@ -153,6 +169,14 @@
           <w:sz w:val="26"/>
           <w:szCs w:val="26"/>
         </w:rPr>
+        <w:t>-</w:t>
+      </w:r>
+      <w:r>
+        <w:rPr>
+          <w:rFonts w:ascii="Times New Roman" w:hAnsi="Times New Roman" w:cs="Times New Roman"/>
+          <w:sz w:val="26"/>
+          <w:szCs w:val="26"/>
+        </w:rPr>
         <w:t>Xóa thông tin nhân viên khi nghỉ việc</w:t>
       </w:r>
       <w:r>
@@ -180,6 +204,14 @@
           <w:sz w:val="26"/>
           <w:szCs w:val="26"/>
         </w:rPr>
+        <w:t>-</w:t>
+      </w:r>
+      <w:r>
+        <w:rPr>
+          <w:rFonts w:ascii="Times New Roman" w:hAnsi="Times New Roman" w:cs="Times New Roman"/>
+          <w:sz w:val="26"/>
+          <w:szCs w:val="26"/>
+        </w:rPr>
         <w:t>Tìm kiếm nhân viên theo mã nhân viên, tên, phòng ban.</w:t>
       </w:r>
       <w:r>
@@ -207,6 +239,14 @@
           <w:sz w:val="26"/>
           <w:szCs w:val="26"/>
         </w:rPr>
+        <w:t>-</w:t>
+      </w:r>
+      <w:r>
+        <w:rPr>
+          <w:rFonts w:ascii="Times New Roman" w:hAnsi="Times New Roman" w:cs="Times New Roman"/>
+          <w:sz w:val="26"/>
+          <w:szCs w:val="26"/>
+        </w:rPr>
         <w:t xml:space="preserve">Xem danh sách toàn bộ nhân viên trong </w:t>
       </w:r>
       <w:r>
@@ -215,8 +255,553 @@
           <w:sz w:val="26"/>
           <w:szCs w:val="26"/>
         </w:rPr>
-        <w:t>một phòng ban được xếp theo thứ tự A-Z sẵn.</w:t>
-      </w:r>
+        <w:t>một phòng ban được xếp theo thứ tự A-Z sẵn</w:t>
+      </w:r>
+      <w:r>
+        <w:rPr>
+          <w:rFonts w:ascii="Times New Roman" w:hAnsi="Times New Roman" w:cs="Times New Roman"/>
+          <w:sz w:val="26"/>
+          <w:szCs w:val="26"/>
+        </w:rPr>
+        <w:t xml:space="preserve"> theo tên</w:t>
+      </w:r>
+      <w:r>
+        <w:rPr>
+          <w:rFonts w:ascii="Times New Roman" w:hAnsi="Times New Roman" w:cs="Times New Roman"/>
+          <w:sz w:val="26"/>
+          <w:szCs w:val="26"/>
+        </w:rPr>
+        <w:t>.</w:t>
+      </w:r>
+    </w:p>
+    <w:p>
+      <w:pPr>
+        <w:ind w:firstLine="851"/>
+        <w:jc w:val="both"/>
+        <w:rPr>
+          <w:rFonts w:ascii="Times New Roman" w:hAnsi="Times New Roman" w:cs="Times New Roman"/>
+          <w:sz w:val="26"/>
+          <w:szCs w:val="26"/>
+        </w:rPr>
+      </w:pPr>
+      <w:r>
+        <w:rPr>
+          <w:rFonts w:ascii="Times New Roman" w:hAnsi="Times New Roman" w:cs="Times New Roman"/>
+          <w:sz w:val="26"/>
+          <w:szCs w:val="26"/>
+        </w:rPr>
+        <w:t>-Hệ thống phải hiển thị đầy đủ thông tin nhân viên: mã id, họ tên, ngày tháng năm sinh, số điện thoại, số ngày nghỉ, số ngày trễ và ghi chú xin nghỉ chờ phê duyệt nếu có.</w:t>
+      </w:r>
+    </w:p>
+    <w:p>
+      <w:pPr>
+        <w:ind w:firstLine="851"/>
+        <w:jc w:val="both"/>
+        <w:rPr>
+          <w:rFonts w:ascii="Times New Roman" w:hAnsi="Times New Roman" w:cs="Times New Roman"/>
+          <w:sz w:val="26"/>
+          <w:szCs w:val="26"/>
+        </w:rPr>
+      </w:pPr>
+      <w:r>
+        <w:rPr>
+          <w:rFonts w:ascii="Times New Roman" w:hAnsi="Times New Roman" w:cs="Times New Roman"/>
+          <w:sz w:val="26"/>
+          <w:szCs w:val="26"/>
+        </w:rPr>
+        <w:t>-</w:t>
+      </w:r>
+      <w:r>
+        <w:rPr>
+          <w:rFonts w:ascii="Times New Roman" w:hAnsi="Times New Roman" w:cs="Times New Roman"/>
+          <w:sz w:val="26"/>
+          <w:szCs w:val="26"/>
+        </w:rPr>
+        <w:t>Manager và admin đều có quyền sử dụng chức năng này, khác ở chỗ admin có toàn quyền còn manager chỉ được phép xem thông tin và quản lý nhân viên thuộc phòng ban của họ và manager không thể thay đổi chức vụ nhân viên lên manager.</w:t>
+      </w:r>
+    </w:p>
+    <w:p>
+      <w:pPr>
+        <w:jc w:val="both"/>
+        <w:rPr>
+          <w:rFonts w:ascii="Times New Roman" w:hAnsi="Times New Roman" w:cs="Times New Roman"/>
+          <w:b/>
+          <w:bCs/>
+          <w:sz w:val="26"/>
+          <w:szCs w:val="26"/>
+        </w:rPr>
+      </w:pPr>
+      <w:r>
+        <w:rPr>
+          <w:rFonts w:ascii="Times New Roman" w:hAnsi="Times New Roman" w:cs="Times New Roman"/>
+          <w:b/>
+          <w:bCs/>
+          <w:sz w:val="26"/>
+          <w:szCs w:val="26"/>
+        </w:rPr>
+        <w:t>2. Quản lý phòng ban</w:t>
+      </w:r>
+    </w:p>
+    <w:p>
+      <w:pPr>
+        <w:ind w:firstLine="851"/>
+        <w:jc w:val="both"/>
+        <w:rPr>
+          <w:rFonts w:ascii="Times New Roman" w:hAnsi="Times New Roman" w:cs="Times New Roman"/>
+          <w:sz w:val="26"/>
+          <w:szCs w:val="26"/>
+        </w:rPr>
+      </w:pPr>
+      <w:r>
+        <w:rPr>
+          <w:rFonts w:ascii="Times New Roman" w:hAnsi="Times New Roman" w:cs="Times New Roman"/>
+          <w:sz w:val="26"/>
+          <w:szCs w:val="26"/>
+        </w:rPr>
+        <w:t>-Quản trị viên hoặc quản lý cấp cao có thể thêm (create) phòng ban mới, chỉnh sửa (update) thông tin phòng ban hoặc xóa (delete) phòng ban khi không còn sử dụng.</w:t>
+      </w:r>
+      <w:r>
+        <w:rPr>
+          <w:rFonts w:ascii="Times New Roman" w:hAnsi="Times New Roman" w:cs="Times New Roman"/>
+          <w:sz w:val="26"/>
+          <w:szCs w:val="26"/>
+        </w:rPr>
+        <w:t xml:space="preserve"> Phòng ban có thể bỏ trống nếu chưa có manager nào thích hợp để quản lý. Và không được phép thêm nhân viên nào vào phòng ban chưa có manager, nếu user lỡ chọn thêm nhân viên vào phòng ban chưa có manager phải từ chối</w:t>
+      </w:r>
+      <w:r>
+        <w:rPr>
+          <w:rFonts w:ascii="Times New Roman" w:hAnsi="Times New Roman" w:cs="Times New Roman"/>
+          <w:sz w:val="26"/>
+          <w:szCs w:val="26"/>
+        </w:rPr>
+        <w:t xml:space="preserve"> </w:t>
+      </w:r>
+      <w:r>
+        <w:rPr>
+          <w:rFonts w:ascii="Times New Roman" w:hAnsi="Times New Roman" w:cs="Times New Roman"/>
+          <w:sz w:val="26"/>
+          <w:szCs w:val="26"/>
+        </w:rPr>
+        <w:t>và hệ thống cần đảm bảo rằng một phòng ban chỉ có một manager duy nhất để tránh xung đột quyền quản lý.</w:t>
+      </w:r>
+    </w:p>
+    <w:p>
+      <w:pPr>
+        <w:ind w:firstLine="851"/>
+        <w:jc w:val="both"/>
+        <w:rPr>
+          <w:rFonts w:ascii="Times New Roman" w:hAnsi="Times New Roman" w:cs="Times New Roman"/>
+          <w:sz w:val="26"/>
+          <w:szCs w:val="26"/>
+        </w:rPr>
+      </w:pPr>
+      <w:r>
+        <w:rPr>
+          <w:rFonts w:ascii="Times New Roman" w:hAnsi="Times New Roman" w:cs="Times New Roman"/>
+          <w:sz w:val="26"/>
+          <w:szCs w:val="26"/>
+        </w:rPr>
+        <w:t>- Ngoài ra, hệ thống phải cho phép phân công nhân viên vào các phòng ban tương ứng và hiển thị danh sách nhân viên thuộc từng phòng ban.</w:t>
+      </w:r>
+    </w:p>
+    <w:p>
+      <w:pPr>
+        <w:jc w:val="both"/>
+        <w:rPr>
+          <w:rFonts w:ascii="Times New Roman" w:hAnsi="Times New Roman" w:cs="Times New Roman"/>
+          <w:b/>
+          <w:bCs/>
+          <w:sz w:val="26"/>
+          <w:szCs w:val="26"/>
+        </w:rPr>
+      </w:pPr>
+      <w:r>
+        <w:rPr>
+          <w:rFonts w:ascii="Times New Roman" w:hAnsi="Times New Roman" w:cs="Times New Roman"/>
+          <w:b/>
+          <w:bCs/>
+          <w:sz w:val="26"/>
+          <w:szCs w:val="26"/>
+        </w:rPr>
+        <w:t>3. Quản lý chấm công</w:t>
+      </w:r>
+    </w:p>
+    <w:p>
+      <w:pPr>
+        <w:ind w:firstLine="851"/>
+        <w:jc w:val="both"/>
+        <w:rPr>
+          <w:rFonts w:ascii="Times New Roman" w:hAnsi="Times New Roman" w:cs="Times New Roman"/>
+          <w:sz w:val="26"/>
+          <w:szCs w:val="26"/>
+        </w:rPr>
+      </w:pPr>
+      <w:r>
+        <w:rPr>
+          <w:rFonts w:ascii="Times New Roman" w:hAnsi="Times New Roman" w:cs="Times New Roman"/>
+          <w:sz w:val="26"/>
+          <w:szCs w:val="26"/>
+        </w:rPr>
+        <w:t>-</w:t>
+      </w:r>
+      <w:r>
+        <w:rPr>
+          <w:rFonts w:ascii="Times New Roman" w:hAnsi="Times New Roman" w:cs="Times New Roman"/>
+          <w:sz w:val="26"/>
+          <w:szCs w:val="26"/>
+        </w:rPr>
+        <w:t xml:space="preserve"> Tại màn hình chờ của nhân viên khi đăng nhập,</w:t>
+      </w:r>
+      <w:r>
+        <w:rPr>
+          <w:rFonts w:ascii="Times New Roman" w:hAnsi="Times New Roman" w:cs="Times New Roman"/>
+          <w:sz w:val="26"/>
+          <w:szCs w:val="26"/>
+        </w:rPr>
+        <w:t xml:space="preserve"> </w:t>
+      </w:r>
+      <w:r>
+        <w:rPr>
+          <w:rFonts w:ascii="Times New Roman" w:hAnsi="Times New Roman" w:cs="Times New Roman"/>
+          <w:sz w:val="26"/>
+          <w:szCs w:val="26"/>
+        </w:rPr>
+        <w:t>h</w:t>
+      </w:r>
+      <w:r>
+        <w:rPr>
+          <w:rFonts w:ascii="Times New Roman" w:hAnsi="Times New Roman" w:cs="Times New Roman"/>
+          <w:sz w:val="26"/>
+          <w:szCs w:val="26"/>
+        </w:rPr>
+        <w:t>ệ thống phải hỗ trợ ghi nhận thời gian làm việc của nhân viên thông qua chức năng check-in và check-out (theo real-time).</w:t>
+      </w:r>
+      <w:r>
+        <w:rPr>
+          <w:rFonts w:ascii="Times New Roman" w:hAnsi="Times New Roman" w:cs="Times New Roman"/>
+          <w:sz w:val="26"/>
+          <w:szCs w:val="26"/>
+        </w:rPr>
+        <w:t xml:space="preserve"> </w:t>
+      </w:r>
+      <w:r>
+        <w:rPr>
+          <w:rFonts w:ascii="Times New Roman" w:hAnsi="Times New Roman" w:cs="Times New Roman"/>
+          <w:sz w:val="26"/>
+          <w:szCs w:val="26"/>
+        </w:rPr>
+        <w:t>Mỗi lần nhân viên thực hiện check-in hoặc check-out, hệ thống phải ghi lại thời gian, ngày làm việc và mã nhân viên để tạo dữ liệu chấm công.</w:t>
+      </w:r>
+      <w:r>
+        <w:rPr>
+          <w:rFonts w:ascii="Times New Roman" w:hAnsi="Times New Roman" w:cs="Times New Roman"/>
+          <w:sz w:val="26"/>
+          <w:szCs w:val="26"/>
+        </w:rPr>
+        <w:t xml:space="preserve"> </w:t>
+      </w:r>
+      <w:r>
+        <w:rPr>
+          <w:rFonts w:ascii="Times New Roman" w:hAnsi="Times New Roman" w:cs="Times New Roman"/>
+          <w:sz w:val="26"/>
+          <w:szCs w:val="26"/>
+        </w:rPr>
+        <w:t xml:space="preserve">Nhân viên có thể xem lịch sử chấm công của bản thân, trong khi manager có thể xem dữ liệu chấm công của </w:t>
+      </w:r>
+      <w:r>
+        <w:rPr>
+          <w:rFonts w:ascii="Times New Roman" w:hAnsi="Times New Roman" w:cs="Times New Roman"/>
+          <w:sz w:val="26"/>
+          <w:szCs w:val="26"/>
+        </w:rPr>
+        <w:lastRenderedPageBreak/>
+        <w:t>nhân viên thuộc phòng ban mình quản lý.</w:t>
+      </w:r>
+      <w:r>
+        <w:rPr>
+          <w:rFonts w:ascii="Times New Roman" w:hAnsi="Times New Roman" w:cs="Times New Roman"/>
+          <w:sz w:val="26"/>
+          <w:szCs w:val="26"/>
+        </w:rPr>
+        <w:t xml:space="preserve"> Lưu ý rằng chỉ cho phép check in rồi mới được checkout, nếu ngày hôm đó nhân viên chưa check in mà đã checkout phải báo lỗi và yêu cầu checkin. Một khi đã checkin thì chỉ có thể dùng checkout, nếu nhấn checkin thì báo lỗi.</w:t>
+      </w:r>
+    </w:p>
+    <w:p>
+      <w:pPr>
+        <w:jc w:val="both"/>
+        <w:rPr>
+          <w:rFonts w:ascii="Times New Roman" w:hAnsi="Times New Roman" w:cs="Times New Roman"/>
+          <w:b/>
+          <w:bCs/>
+          <w:sz w:val="26"/>
+          <w:szCs w:val="26"/>
+        </w:rPr>
+      </w:pPr>
+      <w:r>
+        <w:rPr>
+          <w:rFonts w:ascii="Times New Roman" w:hAnsi="Times New Roman" w:cs="Times New Roman"/>
+          <w:b/>
+          <w:bCs/>
+          <w:sz w:val="26"/>
+          <w:szCs w:val="26"/>
+        </w:rPr>
+        <w:t>4. Quản lý nghỉ phép</w:t>
+      </w:r>
+    </w:p>
+    <w:p>
+      <w:pPr>
+        <w:ind w:firstLine="851"/>
+        <w:jc w:val="both"/>
+        <w:rPr>
+          <w:rFonts w:ascii="Times New Roman" w:hAnsi="Times New Roman" w:cs="Times New Roman"/>
+          <w:sz w:val="26"/>
+          <w:szCs w:val="26"/>
+        </w:rPr>
+      </w:pPr>
+      <w:r>
+        <w:rPr>
+          <w:rFonts w:ascii="Times New Roman" w:hAnsi="Times New Roman" w:cs="Times New Roman"/>
+          <w:sz w:val="26"/>
+          <w:szCs w:val="26"/>
+        </w:rPr>
+        <w:t>- Nhân viên cần nhập ngày bắt đầu nghỉ, ngày kết thúc nghỉ và lý do nghỉ khi gửi đơn. Hệ thống phải kiểm tra số ngày nghỉ còn lại của nhân viên để đảm bảo yêu cầu hợp lệ. Sau khi gửi đơn, manager của phòng ban sẽ có quyền xem, phê duyệt hoặc từ chối yêu cầu nghỉ phép.</w:t>
+      </w:r>
+      <w:r>
+        <w:rPr>
+          <w:rFonts w:ascii="Times New Roman" w:hAnsi="Times New Roman" w:cs="Times New Roman"/>
+          <w:sz w:val="26"/>
+          <w:szCs w:val="26"/>
+        </w:rPr>
+        <w:t xml:space="preserve"> </w:t>
+      </w:r>
+      <w:r>
+        <w:rPr>
+          <w:rFonts w:ascii="Times New Roman" w:hAnsi="Times New Roman" w:cs="Times New Roman"/>
+          <w:sz w:val="26"/>
+          <w:szCs w:val="26"/>
+        </w:rPr>
+        <w:t>Hệ thống phải lưu lại lịch sử nghỉ phép của nhân viên và cập nhật trạng thái đơn nghỉ phép như: đang chờ duyệt, đã duyệt hoặc bị từ chối.</w:t>
+      </w:r>
+    </w:p>
+    <w:p>
+      <w:pPr>
+        <w:jc w:val="both"/>
+        <w:rPr>
+          <w:rFonts w:ascii="Times New Roman" w:hAnsi="Times New Roman" w:cs="Times New Roman"/>
+          <w:b/>
+          <w:bCs/>
+          <w:sz w:val="26"/>
+          <w:szCs w:val="26"/>
+        </w:rPr>
+      </w:pPr>
+      <w:r>
+        <w:rPr>
+          <w:rFonts w:ascii="Times New Roman" w:hAnsi="Times New Roman" w:cs="Times New Roman"/>
+          <w:b/>
+          <w:bCs/>
+          <w:sz w:val="26"/>
+          <w:szCs w:val="26"/>
+        </w:rPr>
+        <w:t>5. Quản lý lương</w:t>
+      </w:r>
+    </w:p>
+    <w:p>
+      <w:pPr>
+        <w:ind w:firstLine="851"/>
+        <w:jc w:val="both"/>
+        <w:rPr>
+          <w:rFonts w:ascii="Times New Roman" w:hAnsi="Times New Roman" w:cs="Times New Roman"/>
+          <w:sz w:val="26"/>
+          <w:szCs w:val="26"/>
+        </w:rPr>
+      </w:pPr>
+      <w:r>
+        <w:rPr>
+          <w:rFonts w:ascii="Times New Roman" w:hAnsi="Times New Roman" w:cs="Times New Roman"/>
+          <w:sz w:val="26"/>
+          <w:szCs w:val="26"/>
+        </w:rPr>
+        <w:t>- Thông tin lương có thể được tính dựa trên lương cơ bản, số ngày làm việc, giờ làm thêm và các khoản thưởng hoặc khấu trừ.</w:t>
+      </w:r>
+    </w:p>
+    <w:p>
+      <w:pPr>
+        <w:ind w:firstLine="851"/>
+        <w:jc w:val="both"/>
+        <w:rPr>
+          <w:rFonts w:ascii="Times New Roman" w:hAnsi="Times New Roman" w:cs="Times New Roman"/>
+          <w:sz w:val="26"/>
+          <w:szCs w:val="26"/>
+        </w:rPr>
+      </w:pPr>
+      <w:r>
+        <w:rPr>
+          <w:rFonts w:ascii="Times New Roman" w:hAnsi="Times New Roman" w:cs="Times New Roman"/>
+          <w:sz w:val="26"/>
+          <w:szCs w:val="26"/>
+        </w:rPr>
+        <w:t xml:space="preserve">- </w:t>
+      </w:r>
+      <w:r>
+        <w:rPr>
+          <w:rFonts w:ascii="Times New Roman" w:hAnsi="Times New Roman" w:cs="Times New Roman"/>
+          <w:sz w:val="26"/>
+          <w:szCs w:val="26"/>
+        </w:rPr>
+        <w:t>Chỉ có bộ phận nhân sự và admin mới có quyền</w:t>
+      </w:r>
+      <w:r>
+        <w:rPr>
+          <w:rFonts w:ascii="Times New Roman" w:hAnsi="Times New Roman" w:cs="Times New Roman"/>
+          <w:sz w:val="26"/>
+          <w:szCs w:val="26"/>
+        </w:rPr>
+        <w:t xml:space="preserve"> xem bảng lương, chỉnh sửa thông tin liên quan và xuất báo cáo lương theo tháng.</w:t>
+      </w:r>
+      <w:r>
+        <w:rPr>
+          <w:rFonts w:ascii="Times New Roman" w:hAnsi="Times New Roman" w:cs="Times New Roman"/>
+          <w:sz w:val="26"/>
+          <w:szCs w:val="26"/>
+        </w:rPr>
+        <w:t xml:space="preserve"> </w:t>
+      </w:r>
+      <w:r>
+        <w:rPr>
+          <w:rFonts w:ascii="Times New Roman" w:hAnsi="Times New Roman" w:cs="Times New Roman"/>
+          <w:sz w:val="26"/>
+          <w:szCs w:val="26"/>
+        </w:rPr>
+        <w:t>Nhân viên chỉ được phép xem bảng lương của chính mình để đảm bảo tính bảo mật.</w:t>
+      </w:r>
+    </w:p>
+    <w:p>
+      <w:pPr>
+        <w:jc w:val="both"/>
+        <w:rPr>
+          <w:rFonts w:ascii="Times New Roman" w:hAnsi="Times New Roman" w:cs="Times New Roman"/>
+          <w:b/>
+          <w:bCs/>
+          <w:sz w:val="26"/>
+          <w:szCs w:val="26"/>
+        </w:rPr>
+      </w:pPr>
+      <w:r>
+        <w:rPr>
+          <w:rFonts w:ascii="Times New Roman" w:hAnsi="Times New Roman" w:cs="Times New Roman"/>
+          <w:b/>
+          <w:bCs/>
+          <w:sz w:val="26"/>
+          <w:szCs w:val="26"/>
+        </w:rPr>
+        <w:t>6. Quản lý tài khoản và phân quyền</w:t>
+      </w:r>
+    </w:p>
+    <w:p>
+      <w:pPr>
+        <w:ind w:firstLine="851"/>
+        <w:jc w:val="both"/>
+        <w:rPr>
+          <w:rFonts w:ascii="Times New Roman" w:hAnsi="Times New Roman" w:cs="Times New Roman"/>
+          <w:sz w:val="26"/>
+          <w:szCs w:val="26"/>
+        </w:rPr>
+      </w:pPr>
+      <w:r>
+        <w:rPr>
+          <w:rFonts w:ascii="Times New Roman" w:hAnsi="Times New Roman" w:cs="Times New Roman"/>
+          <w:sz w:val="26"/>
+          <w:szCs w:val="26"/>
+        </w:rPr>
+        <w:t>- Mỗi người dùng sẽ có một tài khoản riêng và được phân quyền dựa trên vai trò như: admin, manager hoặc nhân viên.</w:t>
+      </w:r>
+    </w:p>
+    <w:p>
+      <w:pPr>
+        <w:ind w:firstLine="851"/>
+        <w:jc w:val="both"/>
+        <w:rPr>
+          <w:rFonts w:ascii="Times New Roman" w:hAnsi="Times New Roman" w:cs="Times New Roman"/>
+          <w:sz w:val="26"/>
+          <w:szCs w:val="26"/>
+        </w:rPr>
+      </w:pPr>
+      <w:r>
+        <w:rPr>
+          <w:rFonts w:ascii="Times New Roman" w:hAnsi="Times New Roman" w:cs="Times New Roman"/>
+          <w:sz w:val="26"/>
+          <w:szCs w:val="26"/>
+        </w:rPr>
+        <w:t>- Admin có toàn quyền quản lý hệ thống.</w:t>
+      </w:r>
+    </w:p>
+    <w:p>
+      <w:pPr>
+        <w:ind w:firstLine="851"/>
+        <w:jc w:val="both"/>
+        <w:rPr>
+          <w:rFonts w:ascii="Times New Roman" w:hAnsi="Times New Roman" w:cs="Times New Roman"/>
+          <w:sz w:val="26"/>
+          <w:szCs w:val="26"/>
+        </w:rPr>
+      </w:pPr>
+      <w:r>
+        <w:rPr>
+          <w:rFonts w:ascii="Times New Roman" w:hAnsi="Times New Roman" w:cs="Times New Roman"/>
+          <w:sz w:val="26"/>
+          <w:szCs w:val="26"/>
+        </w:rPr>
+        <w:t>- Manager chỉ quản lý nhân viên thuộc phòng ban của mình.</w:t>
+      </w:r>
+    </w:p>
+    <w:p>
+      <w:pPr>
+        <w:ind w:firstLine="851"/>
+        <w:jc w:val="both"/>
+        <w:rPr>
+          <w:rFonts w:ascii="Times New Roman" w:hAnsi="Times New Roman" w:cs="Times New Roman"/>
+          <w:sz w:val="26"/>
+          <w:szCs w:val="26"/>
+        </w:rPr>
+      </w:pPr>
+      <w:r>
+        <w:rPr>
+          <w:rFonts w:ascii="Times New Roman" w:hAnsi="Times New Roman" w:cs="Times New Roman"/>
+          <w:sz w:val="26"/>
+          <w:szCs w:val="26"/>
+        </w:rPr>
+        <w:t>- Nhân viên chỉ xem được thông tin cá nhân và dữ liệu liên quan.</w:t>
+      </w:r>
+    </w:p>
+    <w:p>
+      <w:pPr>
+        <w:ind w:firstLine="851"/>
+        <w:jc w:val="both"/>
+        <w:rPr>
+          <w:rFonts w:ascii="Times New Roman" w:hAnsi="Times New Roman" w:cs="Times New Roman"/>
+          <w:sz w:val="26"/>
+          <w:szCs w:val="26"/>
+        </w:rPr>
+      </w:pPr>
+      <w:r>
+        <w:rPr>
+          <w:rFonts w:ascii="Times New Roman" w:hAnsi="Times New Roman" w:cs="Times New Roman"/>
+          <w:sz w:val="26"/>
+          <w:szCs w:val="26"/>
+        </w:rPr>
+        <w:t>Với tên đăng nhập là ID nhân viên và mật khẩu là do admin cung cấp, trong trường hợp quên mật khẩu thì chỉ có thể báo với quản lý cấp cao. Do đó chỉ có chức năng đăng nhập, không có đăng ký và quên mật khẩu</w:t>
+      </w:r>
+    </w:p>
+    <w:p>
+      <w:pPr>
+        <w:ind w:firstLine="851"/>
+        <w:jc w:val="both"/>
+        <w:rPr>
+          <w:rFonts w:ascii="Times New Roman" w:hAnsi="Times New Roman" w:cs="Times New Roman"/>
+          <w:sz w:val="26"/>
+          <w:szCs w:val="26"/>
+        </w:rPr>
+      </w:pPr>
     </w:p>
     <w:sectPr>
       <w:pgSz w:w="11906" w:h="16838" w:code="9"/>

</xml_diff>